<commit_message>
Update SDLC project report to match final implemented features
</commit_message>
<xml_diff>
--- a/Smart_Expense_Tracker_AI_Financial_Advisor.docx
+++ b/Smart_Expense_Tracker_AI_Financial_Advisor.docx
@@ -1500,7 +1500,7 @@
     </w:p>
     <w:p>
       <w:r>
-        <w:t>Backend contains BudgetAlertService and EmailService for budget-related alerting/email functionality.</w:t>
+        <w:t>BudgetAlertService and EmailService support exceeded-budget email notifications. Email notifications are disabled by default and can be enabled through environment configuration.</w:t>
       </w:r>
     </w:p>
     <w:p>
@@ -2037,7 +2037,7 @@
     </w:p>
     <w:p>
       <w:r>
-        <w:t>The main application workflows were manually tested. The user reported that the planned seven functional tests passed. The authentication browser-history issue after logout was also tested and fixed.</w:t>
+        <w:t>The main application workflows were manually tested, and the planned seven functional tests passed. Protected-route behavior after logout was also tested.</w:t>
       </w:r>
     </w:p>
     <w:p>
@@ -2136,7 +2136,7 @@
     </w:p>
     <w:p>
       <w:r>
-        <w:t>A previously shared Maven test log showed a context-load failure caused by database authentication/configuration (root access without a password). This was a test-environment configuration issue. The currently demonstrated web application was manually tested successfully.</w:t>
+        <w:t>An earlier Maven test log showed a context-load failure caused by database authentication/configuration (root access without a password). This was an environment configuration issue rather than a documented application feature. The currently demonstrated web application was manually tested successfully.</w:t>
       </w:r>
     </w:p>
     <w:p>
@@ -2153,7 +2153,7 @@
         <w:spacing w:after="40"/>
       </w:pPr>
       <w:r>
-        <w:t>Use environment variables/secure secrets for database credentials and external API keys.</w:t>
+        <w:t>Continue using environment variables/secure secret management for database credentials, Gemini API keys, and email credentials.</w:t>
       </w:r>
     </w:p>
     <w:p>
@@ -2180,7 +2180,7 @@
         <w:spacing w:after="40"/>
       </w:pPr>
       <w:r>
-        <w:t>Add richer financial charts and analytics.</w:t>
+        <w:t>Expand financial charts and analytics beyond the currently implemented dashboard and monthly/yearly summaries.</w:t>
       </w:r>
     </w:p>
     <w:p>
@@ -2207,7 +2207,7 @@
         <w:spacing w:after="40"/>
       </w:pPr>
       <w:r>
-        <w:t>Expand export/report formats.</w:t>
+        <w:t>Expand export/report formats beyond the currently implemented PDF and Excel reports.</w:t>
       </w:r>
     </w:p>
     <w:p>
@@ -2239,6 +2239,11 @@
     <w:p>
       <w:r>
         <w:t>Smart Expense Tracker with AI Financial Advisor demonstrates the software development process from planning and requirements through design, implementation, testing, release, and future maintenance. It combines financial record management, budgeting, reporting, and AI-assisted guidance in one full-stack system.</w:t>
+      </w:r>
+    </w:p>
+    <w:p>
+      <w:r>
+        <w:t>Implementation Status Note: The current implementation includes dashboard analytics, budget monitoring, PDF/Excel reporting, Gemini-based AI advice with local fallback, profile management, responsive UI, password hashing with BCrypt, and user-ownership checks. These are implemented features, not future enhancements.</w:t>
       </w:r>
     </w:p>
     <w:p>
@@ -2381,6 +2386,12 @@
     </w:pPr>
     <w:r>
       <w:t>Smart Expense Tracker with AI Financial Advisor | SDLC Project Report</w:t>
+    </w:r>
+    <w:r>
+      <w:rPr>
+        <w:sz w:val="16"/>
+      </w:rPr>
+      <w:t>Smart Expense Tracker with AI Financial Advisor — Updated Project Report</w:t>
     </w:r>
   </w:p>
 </w:ftr>

</xml_diff>